<commit_message>
Answer "is further expansion worthwhile" with a number, not an opinion
The brief asks it explicitly and section 8 was answering it with a ranked list of
opinions. The first entry is now measured: 285,842 bracketed-gap domains have
never been queried, priced on 514 live queries at 103,000-164,000 net-new pairs
and 0.88-1.03 percentage points. It needs no source, no download and no
permission, only request throughput, which section 5 explains we lack. The first
estimate was 1.6-1.9x higher and was cut before it reached the document.

Section 2 also carried "roughly sixty" closed families, which was true when
written and is now 87. It points at section 6's generated count instead, so the
document holds one such number rather than two that can disagree.

Section 8 also now records the qualification the search established: the capture
census appears to be singular rather than the first of a family, since six
further sweeps of the same repositories returned nothing in window.
</commit_message>
<xml_diff>
--- a/docs/report.docx
+++ b/docs/report.docx
@@ -75,7 +75,7 @@
                 <w:b/>
                 <w:bCs/>
               </w:rPr>
-              <w:t xml:space="preserve">437,419</w:t>
+              <w:t xml:space="preserve">437,612</w:t>
             </w:r>
           </w:p>
         </w:tc>
@@ -100,7 +100,7 @@
               <w:jc w:val="right"/>
             </w:pPr>
             <w:r>
-              <w:t xml:space="preserve">370,807</w:t>
+              <w:t xml:space="preserve">370,982</w:t>
             </w:r>
           </w:p>
         </w:tc>
@@ -129,7 +129,7 @@
                 <w:b/>
                 <w:bCs/>
               </w:rPr>
-              <w:t xml:space="preserve">208,587</w:t>
+              <w:t xml:space="preserve">208,665</w:t>
             </w:r>
           </w:p>
         </w:tc>
@@ -158,7 +158,7 @@
                 <w:b/>
                 <w:bCs/>
               </w:rPr>
-              <w:t xml:space="preserve">305,662.2</w:t>
+              <w:t xml:space="preserve">305,795.4</w:t>
             </w:r>
           </w:p>
         </w:tc>
@@ -187,7 +187,7 @@
                 <w:b/>
                 <w:bCs/>
               </w:rPr>
-              <w:t xml:space="preserve">3.6620%</w:t>
+              <w:t xml:space="preserve">3.6636%</w:t>
             </w:r>
           </w:p>
         </w:tc>
@@ -413,19 +413,19 @@
               <w:jc w:val="right"/>
             </w:pPr>
             <w:r>
-              <w:t xml:space="preserve">19,592</w:t>
-            </w:r>
-          </w:p>
-        </w:tc>
-        <w:tc>
-          <w:tcPr/>
-          <w:p>
-            <w:pPr>
-              <w:pStyle w:val="Compact"/>
-              <w:jc w:val="right"/>
-            </w:pPr>
-            <w:r>
-              <w:t xml:space="preserve">583 (3.0%)</w:t>
+              <w:t xml:space="preserve">19,599</w:t>
+            </w:r>
+          </w:p>
+        </w:tc>
+        <w:tc>
+          <w:tcPr/>
+          <w:p>
+            <w:pPr>
+              <w:pStyle w:val="Compact"/>
+              <w:jc w:val="right"/>
+            </w:pPr>
+            <w:r>
+              <w:t xml:space="preserve">590 (3.0%)</w:t>
             </w:r>
           </w:p>
         </w:tc>
@@ -462,19 +462,19 @@
               <w:jc w:val="right"/>
             </w:pPr>
             <w:r>
-              <w:t xml:space="preserve">44,387</w:t>
-            </w:r>
-          </w:p>
-        </w:tc>
-        <w:tc>
-          <w:tcPr/>
-          <w:p>
-            <w:pPr>
-              <w:pStyle w:val="Compact"/>
-              <w:jc w:val="right"/>
-            </w:pPr>
-            <w:r>
-              <w:t xml:space="preserve">1,993 (4.5%)</w:t>
+              <w:t xml:space="preserve">44,399</w:t>
+            </w:r>
+          </w:p>
+        </w:tc>
+        <w:tc>
+          <w:tcPr/>
+          <w:p>
+            <w:pPr>
+              <w:pStyle w:val="Compact"/>
+              <w:jc w:val="right"/>
+            </w:pPr>
+            <w:r>
+              <w:t xml:space="preserve">2,006 (4.5%)</w:t>
             </w:r>
           </w:p>
         </w:tc>
@@ -511,19 +511,19 @@
               <w:jc w:val="right"/>
             </w:pPr>
             <w:r>
-              <w:t xml:space="preserve">60,347</w:t>
-            </w:r>
-          </w:p>
-        </w:tc>
-        <w:tc>
-          <w:tcPr/>
-          <w:p>
-            <w:pPr>
-              <w:pStyle w:val="Compact"/>
-              <w:jc w:val="right"/>
-            </w:pPr>
-            <w:r>
-              <w:t xml:space="preserve">4,174 (6.9%)</w:t>
+              <w:t xml:space="preserve">60,370</w:t>
+            </w:r>
+          </w:p>
+        </w:tc>
+        <w:tc>
+          <w:tcPr/>
+          <w:p>
+            <w:pPr>
+              <w:pStyle w:val="Compact"/>
+              <w:jc w:val="right"/>
+            </w:pPr>
+            <w:r>
+              <w:t xml:space="preserve">4,197 (7.0%)</w:t>
             </w:r>
           </w:p>
         </w:tc>
@@ -560,19 +560,19 @@
               <w:jc w:val="right"/>
             </w:pPr>
             <w:r>
-              <w:t xml:space="preserve">189,872</w:t>
-            </w:r>
-          </w:p>
-        </w:tc>
-        <w:tc>
-          <w:tcPr/>
-          <w:p>
-            <w:pPr>
-              <w:pStyle w:val="Compact"/>
-              <w:jc w:val="right"/>
-            </w:pPr>
-            <w:r>
-              <w:t xml:space="preserve">30,397 (16.0%)</w:t>
+              <w:t xml:space="preserve">190,023</w:t>
+            </w:r>
+          </w:p>
+        </w:tc>
+        <w:tc>
+          <w:tcPr/>
+          <w:p>
+            <w:pPr>
+              <w:pStyle w:val="Compact"/>
+              <w:jc w:val="right"/>
+            </w:pPr>
+            <w:r>
+              <w:t xml:space="preserve">30,548 (16.1%)</w:t>
             </w:r>
           </w:p>
         </w:tc>
@@ -621,7 +621,7 @@
                 <w:b/>
                 <w:bCs/>
               </w:rPr>
-              <w:t xml:space="preserve">437,419</w:t>
+              <w:t xml:space="preserve">437,612</w:t>
             </w:r>
           </w:p>
         </w:tc>
@@ -637,7 +637,7 @@
                 <w:b/>
                 <w:bCs/>
               </w:rPr>
-              <w:t xml:space="preserve">37,193 (8.5%)</w:t>
+              <w:t xml:space="preserve">37,387 (8.5%)</w:t>
             </w:r>
           </w:p>
         </w:tc>
@@ -704,7 +704,7 @@
           <w:b/>
           <w:bCs/>
         </w:rPr>
-        <w:t xml:space="preserve">111,679.73</w:t>
+        <w:t xml:space="preserve">111,546.57</w:t>
       </w:r>
       <w:r>
         <w:t xml:space="preserve">.</w:t>
@@ -823,7 +823,7 @@
         <w:t xml:space="preserve"> </w:t>
       </w:r>
       <w:r>
-        <w:t xml:space="preserve">reads 3.6620%. Both numbers are correct and only the second is the one being accepted against.</w:t>
+        <w:t xml:space="preserve">reads 3.6636%. Both numbers are correct and only the second is the one being accepted against.</w:t>
       </w:r>
     </w:p>
     <w:p>
@@ -1411,7 +1411,13 @@
         <w:t xml:space="preserve"> </w:t>
       </w:r>
       <w:r>
-        <w:t xml:space="preserve">the cheap ones, and the register of families closed on measurement now stands at roughly sixty. So the</w:t>
+        <w:t xml:space="preserve">the cheap ones, and the register of families closed on measurement is now the larger half of the count</w:t>
+      </w:r>
+      <w:r>
+        <w:t xml:space="preserve"> </w:t>
+      </w:r>
+      <w:r>
+        <w:t xml:space="preserve">in section 6. So the</w:t>
       </w:r>
       <w:r>
         <w:t xml:space="preserve"> </w:t>
@@ -2783,19 +2789,19 @@
               <w:jc w:val="right"/>
             </w:pPr>
             <w:r>
-              <w:t xml:space="preserve">37,098</w:t>
-            </w:r>
-          </w:p>
-        </w:tc>
-        <w:tc>
-          <w:tcPr/>
-          <w:p>
-            <w:pPr>
-              <w:pStyle w:val="Compact"/>
-              <w:jc w:val="right"/>
-            </w:pPr>
-            <w:r>
-              <w:t xml:space="preserve">31,593.8</w:t>
+              <w:t xml:space="preserve">37,291</w:t>
+            </w:r>
+          </w:p>
+        </w:tc>
+        <w:tc>
+          <w:tcPr/>
+          <w:p>
+            <w:pPr>
+              <w:pStyle w:val="Compact"/>
+              <w:jc w:val="right"/>
+            </w:pPr>
+            <w:r>
+              <w:t xml:space="preserve">31,726.9</w:t>
             </w:r>
           </w:p>
         </w:tc>
@@ -3584,7 +3590,7 @@
                 <w:b/>
                 <w:bCs/>
               </w:rPr>
-              <w:t xml:space="preserve">437,419</w:t>
+              <w:t xml:space="preserve">437,612</w:t>
             </w:r>
           </w:p>
         </w:tc>
@@ -3600,7 +3606,7 @@
                 <w:b/>
                 <w:bCs/>
               </w:rPr>
-              <w:t xml:space="preserve">305,662.2</w:t>
+              <w:t xml:space="preserve">305,795.4</w:t>
             </w:r>
           </w:p>
         </w:tc>
@@ -3615,7 +3621,7 @@
           <w:b/>
           <w:bCs/>
         </w:rPr>
-        <w:t xml:space="preserve">All 14 are master sources, so all 437,419 pairs are admitted to the annual files.</w:t>
+        <w:t xml:space="preserve">All 14 are master sources, so all 437,612 pairs are admitted to the annual files.</w:t>
       </w:r>
       <w:r>
         <w:t xml:space="preserve"> </w:t>
@@ -4509,7 +4515,7 @@
         <w:pStyle w:val="BodyText"/>
       </w:pPr>
       <w:r>
-        <w:t xml:space="preserve">Beyond that, 5,075 of this round's pairs are confirmed by two or more independent collection lineages rather than one, and every asserted pair in the collection carries 1.5956 distinct sources on average.</w:t>
+        <w:t xml:space="preserve">Beyond that, 5,076 of this round's pairs are confirmed by two or more independent collection lineages rather than one, and every asserted pair in the collection carries 1.5957 distinct sources on average.</w:t>
       </w:r>
     </w:p>
     <w:bookmarkEnd w:id="15"/>
@@ -4863,31 +4869,31 @@
               <w:jc w:val="right"/>
             </w:pPr>
             <w:r>
-              <w:t xml:space="preserve">147</w:t>
-            </w:r>
-          </w:p>
-        </w:tc>
-        <w:tc>
-          <w:tcPr/>
-          <w:p>
-            <w:pPr>
-              <w:pStyle w:val="Compact"/>
-              <w:jc w:val="right"/>
-            </w:pPr>
-            <w:r>
-              <w:t xml:space="preserve">97,288</w:t>
-            </w:r>
-          </w:p>
-        </w:tc>
-        <w:tc>
-          <w:tcPr/>
-          <w:p>
-            <w:pPr>
-              <w:pStyle w:val="Compact"/>
-              <w:jc w:val="right"/>
-            </w:pPr>
-            <w:r>
-              <w:t xml:space="preserve">81,722</w:t>
+              <w:t xml:space="preserve">148</w:t>
+            </w:r>
+          </w:p>
+        </w:tc>
+        <w:tc>
+          <w:tcPr/>
+          <w:p>
+            <w:pPr>
+              <w:pStyle w:val="Compact"/>
+              <w:jc w:val="right"/>
+            </w:pPr>
+            <w:r>
+              <w:t xml:space="preserve">97,888</w:t>
+            </w:r>
+          </w:p>
+        </w:tc>
+        <w:tc>
+          <w:tcPr/>
+          <w:p>
+            <w:pPr>
+              <w:pStyle w:val="Compact"/>
+              <w:jc w:val="right"/>
+            </w:pPr>
+            <w:r>
+              <w:t xml:space="preserve">82,221</w:t>
             </w:r>
           </w:p>
         </w:tc>
@@ -4911,31 +4917,31 @@
               <w:jc w:val="right"/>
             </w:pPr>
             <w:r>
-              <w:t xml:space="preserve">41.8%</w:t>
-            </w:r>
-          </w:p>
-        </w:tc>
-        <w:tc>
-          <w:tcPr/>
-          <w:p>
-            <w:pPr>
-              <w:pStyle w:val="Compact"/>
-              <w:jc w:val="right"/>
-            </w:pPr>
-            <w:r>
-              <w:t xml:space="preserve">82,305</w:t>
-            </w:r>
-          </w:p>
-        </w:tc>
-        <w:tc>
-          <w:tcPr/>
-          <w:p>
-            <w:pPr>
-              <w:pStyle w:val="Compact"/>
-              <w:jc w:val="right"/>
-            </w:pPr>
-            <w:r>
-              <w:t xml:space="preserve">51,092</w:t>
+              <w:t xml:space="preserve">41.6%</w:t>
+            </w:r>
+          </w:p>
+        </w:tc>
+        <w:tc>
+          <w:tcPr/>
+          <w:p>
+            <w:pPr>
+              <w:pStyle w:val="Compact"/>
+              <w:jc w:val="right"/>
+            </w:pPr>
+            <w:r>
+              <w:t xml:space="preserve">82,807</w:t>
+            </w:r>
+          </w:p>
+        </w:tc>
+        <w:tc>
+          <w:tcPr/>
+          <w:p>
+            <w:pPr>
+              <w:pStyle w:val="Compact"/>
+              <w:jc w:val="right"/>
+            </w:pPr>
+            <w:r>
+              <w:t xml:space="preserve">51,176</w:t>
             </w:r>
           </w:p>
         </w:tc>
@@ -4963,31 +4969,31 @@
               <w:jc w:val="right"/>
             </w:pPr>
             <w:r>
-              <w:t xml:space="preserve">197</w:t>
-            </w:r>
-          </w:p>
-        </w:tc>
-        <w:tc>
-          <w:tcPr/>
-          <w:p>
-            <w:pPr>
-              <w:pStyle w:val="Compact"/>
-              <w:jc w:val="right"/>
-            </w:pPr>
-            <w:r>
-              <w:t xml:space="preserve">58,941</w:t>
-            </w:r>
-          </w:p>
-        </w:tc>
-        <w:tc>
-          <w:tcPr/>
-          <w:p>
-            <w:pPr>
-              <w:pStyle w:val="Compact"/>
-              <w:jc w:val="right"/>
-            </w:pPr>
-            <w:r>
-              <w:t xml:space="preserve">51,982</w:t>
+              <w:t xml:space="preserve">198</w:t>
+            </w:r>
+          </w:p>
+        </w:tc>
+        <w:tc>
+          <w:tcPr/>
+          <w:p>
+            <w:pPr>
+              <w:pStyle w:val="Compact"/>
+              <w:jc w:val="right"/>
+            </w:pPr>
+            <w:r>
+              <w:t xml:space="preserve">59,241</w:t>
+            </w:r>
+          </w:p>
+        </w:tc>
+        <w:tc>
+          <w:tcPr/>
+          <w:p>
+            <w:pPr>
+              <w:pStyle w:val="Compact"/>
+              <w:jc w:val="right"/>
+            </w:pPr>
+            <w:r>
+              <w:t xml:space="preserve">52,235</w:t>
             </w:r>
           </w:p>
         </w:tc>
@@ -5011,31 +5017,31 @@
               <w:jc w:val="right"/>
             </w:pPr>
             <w:r>
-              <w:t xml:space="preserve">70.5%</w:t>
-            </w:r>
-          </w:p>
-        </w:tc>
-        <w:tc>
-          <w:tcPr/>
-          <w:p>
-            <w:pPr>
-              <w:pStyle w:val="Compact"/>
-              <w:jc w:val="right"/>
-            </w:pPr>
-            <w:r>
-              <w:t xml:space="preserve">52,054</w:t>
-            </w:r>
-          </w:p>
-        </w:tc>
-        <w:tc>
-          <w:tcPr/>
-          <w:p>
-            <w:pPr>
-              <w:pStyle w:val="Compact"/>
-              <w:jc w:val="right"/>
-            </w:pPr>
-            <w:r>
-              <w:t xml:space="preserve">115,335</w:t>
+              <w:t xml:space="preserve">70.7%</w:t>
+            </w:r>
+          </w:p>
+        </w:tc>
+        <w:tc>
+          <w:tcPr/>
+          <w:p>
+            <w:pPr>
+              <w:pStyle w:val="Compact"/>
+              <w:jc w:val="right"/>
+            </w:pPr>
+            <w:r>
+              <w:t xml:space="preserve">52,323</w:t>
+            </w:r>
+          </w:p>
+        </w:tc>
+        <w:tc>
+          <w:tcPr/>
+          <w:p>
+            <w:pPr>
+              <w:pStyle w:val="Compact"/>
+              <w:jc w:val="right"/>
+            </w:pPr>
+            <w:r>
+              <w:t xml:space="preserve">116,189</w:t>
             </w:r>
           </w:p>
         </w:tc>
@@ -5568,7 +5574,7 @@
                 <w:b/>
                 <w:bCs/>
               </w:rPr>
-              <w:t xml:space="preserve">637</w:t>
+              <w:t xml:space="preserve">639</w:t>
             </w:r>
           </w:p>
         </w:tc>
@@ -5584,7 +5590,7 @@
                 <w:b/>
                 <w:bCs/>
               </w:rPr>
-              <w:t xml:space="preserve">287,868</w:t>
+              <w:t xml:space="preserve">288,768</w:t>
             </w:r>
           </w:p>
         </w:tc>
@@ -5600,7 +5606,7 @@
                 <w:b/>
                 <w:bCs/>
               </w:rPr>
-              <w:t xml:space="preserve">249,539</w:t>
+              <w:t xml:space="preserve">250,291</w:t>
             </w:r>
           </w:p>
         </w:tc>
@@ -5632,7 +5638,7 @@
                 <w:b/>
                 <w:bCs/>
               </w:rPr>
-              <w:t xml:space="preserve">68.8%</w:t>
+              <w:t xml:space="preserve">68.7%</w:t>
             </w:r>
           </w:p>
         </w:tc>
@@ -5648,7 +5654,7 @@
                 <w:b/>
                 <w:bCs/>
               </w:rPr>
-              <w:t xml:space="preserve">250,893</w:t>
+              <w:t xml:space="preserve">251,664</w:t>
             </w:r>
           </w:p>
         </w:tc>
@@ -5664,7 +5670,7 @@
                 <w:b/>
                 <w:bCs/>
               </w:rPr>
-              <w:t xml:space="preserve">516,741</w:t>
+              <w:t xml:space="preserve">517,679</w:t>
             </w:r>
           </w:p>
         </w:tc>
@@ -5687,7 +5693,7 @@
         <w:pStyle w:val="BodyText"/>
       </w:pPr>
       <w:r>
-        <w:t xml:space="preserve">Of 287,868 queries, 249,539 were answered (86.7%). The 38,329 that were not divide into two kinds, and the smaller kind is the one usually discussed.</w:t>
+        <w:t xml:space="preserve">Of 288,768 queries, 250,291 were answered (86.7%). The 38,477 that were not divide into two kinds, and the smaller kind is the one usually discussed.</w:t>
       </w:r>
       <w:r>
         <w:t xml:space="preserve"> </w:t>
@@ -5697,10 +5703,10 @@
           <w:b/>
           <w:bCs/>
         </w:rPr>
-        <w:t xml:space="preserve">HTTP-level errors are 2,760 (0.96%)</w:t>
-      </w:r>
-      <w:r>
-        <w:t xml:space="preserve">: 0 rate limits (429), 1,994 server errors (500, 502, 503, 504) and 766 refusals (403).</w:t>
+        <w:t xml:space="preserve">HTTP-level errors are 2,770 (0.96%)</w:t>
+      </w:r>
+      <w:r>
+        <w:t xml:space="preserve">: 0 rate limits (429), 1,994 server errors (500, 502, 503, 504) and 776 refusals (403).</w:t>
       </w:r>
       <w:r>
         <w:t xml:space="preserve"> </w:t>
@@ -5710,10 +5716,10 @@
           <w:b/>
           <w:bCs/>
         </w:rPr>
-        <w:t xml:space="preserve">Transport-level failures are 35,569 (12.36%)</w:t>
-      </w:r>
-      <w:r>
-        <w:t xml:space="preserve">: 27,428 connections refused or reset and 8,141 timed out. So the binding constraint is not a status code we could read and obey, it is the connection being dropped before a status exists. Rate limits and server errors are retried with exponential backoff honouring</w:t>
+        <w:t xml:space="preserve">Transport-level failures are 35,707 (12.37%)</w:t>
+      </w:r>
+      <w:r>
+        <w:t xml:space="preserve">: 27,520 connections refused or reset and 8,187 timed out. So the binding constraint is not a status code we could read and obey, it is the connection being dropped before a status exists. Rate limits and server errors are retried with exponential backoff honouring</w:t>
       </w:r>
       <w:r>
         <w:t xml:space="preserve"> </w:t>
@@ -5916,10 +5922,10 @@
           <w:b/>
           <w:bCs/>
         </w:rPr>
-        <w:t xml:space="preserve">107 source families have been searched and recorded</w:t>
-      </w:r>
-      <w:r>
-        <w:t xml:space="preserve">: 24 developed far enough to earn their own section, and 83 evaluated and closed, each with the measurement that closed it. The developed ones:</w:t>
+        <w:t xml:space="preserve">111 source families have been searched and recorded</w:t>
+      </w:r>
+      <w:r>
+        <w:t xml:space="preserve">: 24 developed far enough to earn their own section, and 87 evaluated and closed, each with the measurement that closed it. The developed ones:</w:t>
       </w:r>
     </w:p>
     <w:p>
@@ -6581,7 +6587,7 @@
         <w:pStyle w:val="FirstParagraph"/>
       </w:pPr>
       <w:r>
-        <w:t xml:space="preserve">The 83 closed families are listed under</w:t>
+        <w:t xml:space="preserve">The 87 closed families are listed under</w:t>
       </w:r>
       <w:r>
         <w:t xml:space="preserve"> </w:t>
@@ -7875,6 +7881,18 @@
         </w:rPr>
         <w:t xml:space="preserve">Where further expansion is worthwhile, in order.</w:t>
       </w:r>
+      <w:r>
+        <w:t xml:space="preserve"> </w:t>
+      </w:r>
+      <w:r>
+        <w:t xml:space="preserve">The first entry is measured rather than argued,</w:t>
+      </w:r>
+      <w:r>
+        <w:t xml:space="preserve"> </w:t>
+      </w:r>
+      <w:r>
+        <w:t xml:space="preserve">which is the form this question deserves.</w:t>
+      </w:r>
     </w:p>
     <w:p>
       <w:pPr>
@@ -7889,25 +7907,118 @@
           <w:b/>
           <w:bCs/>
         </w:rPr>
+        <w:t xml:space="preserve">The bracketed gaps we already hold and have never asked about.</w:t>
+      </w:r>
+      <w:r>
+        <w:t xml:space="preserve"> </w:t>
+      </w:r>
+      <w:r>
+        <w:t xml:space="preserve">A domain dated in year Y-1 and</w:t>
+      </w:r>
+      <w:r>
+        <w:t xml:space="preserve"> </w:t>
+      </w:r>
+      <w:r>
+        <w:t xml:space="preserve">Y+1 but not Y is the highest-probability query this project has: the domain is known to have existed</w:t>
+      </w:r>
+      <w:r>
+        <w:t xml:space="preserve"> </w:t>
+      </w:r>
+      <w:r>
+        <w:t xml:space="preserve">on both sides of the gap, and the completeness engine answers such queries at 85 to 97%.</w:t>
+      </w:r>
+      <w:r>
+        <w:t xml:space="preserve"> </w:t>
+      </w:r>
+      <w:r>
+        <w:rPr>
+          <w:b/>
+          <w:bCs/>
+        </w:rPr>
+        <w:t xml:space="preserve">285,842 of them have never been queried.</w:t>
+      </w:r>
+      <w:r>
+        <w:t xml:space="preserve"> </w:t>
+      </w:r>
+      <w:r>
+        <w:t xml:space="preserve">Priced on 514 live queries rather than projected, that</w:t>
+      </w:r>
+      <w:r>
+        <w:t xml:space="preserve"> </w:t>
+      </w:r>
+      <w:r>
+        <w:t xml:space="preserve">is</w:t>
+      </w:r>
+      <w:r>
+        <w:t xml:space="preserve"> </w:t>
+      </w:r>
+      <w:r>
+        <w:rPr>
+          <w:b/>
+          <w:bCs/>
+        </w:rPr>
+        <w:t xml:space="preserve">103,000 to 164,000 net-new pairs and 73,061 to 85,627 equivalent-English</w:t>
+      </w:r>
+      <w:r>
+        <w:t xml:space="preserve">, which is 0.88 to</w:t>
+      </w:r>
+      <w:r>
+        <w:t xml:space="preserve"> </w:t>
+      </w:r>
+      <w:r>
+        <w:t xml:space="preserve">1.03 percentage points. It needs no new source, no download and no permission; it needs request</w:t>
+      </w:r>
+      <w:r>
+        <w:t xml:space="preserve"> </w:t>
+      </w:r>
+      <w:r>
+        <w:t xml:space="preserve">throughput, which section 5 explains we do not have in quantity. A first estimate of this was 1.6 to</w:t>
+      </w:r>
+      <w:r>
+        <w:t xml:space="preserve"> </w:t>
+      </w:r>
+      <w:r>
+        <w:t xml:space="preserve">1.9x higher and was cut on measurement before being written down here.</w:t>
+      </w:r>
+    </w:p>
+    <w:p>
+      <w:pPr>
+        <w:pStyle w:val="Compact"/>
+        <w:numPr>
+          <w:ilvl w:val="0"/>
+          <w:numId w:val="1004"/>
+        </w:numPr>
+      </w:pPr>
+      <w:r>
+        <w:rPr>
+          <w:b/>
+          <w:bCs/>
+        </w:rPr>
         <w:t xml:space="preserve">Bulk dated corpora in research repositories.</w:t>
       </w:r>
       <w:r>
         <w:t xml:space="preserve"> </w:t>
       </w:r>
       <w:r>
-        <w:t xml:space="preserve">The DRUM result establishes both that they exist and</w:t>
-      </w:r>
-      <w:r>
-        <w:t xml:space="preserve"> </w:t>
-      </w:r>
-      <w:r>
-        <w:t xml:space="preserve">that they dwarf per-domain querying. This is the highest-value direction by a wide margin and it is</w:t>
-      </w:r>
-      <w:r>
-        <w:t xml:space="preserve"> </w:t>
-      </w:r>
-      <w:r>
-        <w:t xml:space="preserve">where the discovery system is now pointed.</w:t>
+        <w:t xml:space="preserve">The result described in section 1 establishes both</w:t>
+      </w:r>
+      <w:r>
+        <w:t xml:space="preserve"> </w:t>
+      </w:r>
+      <w:r>
+        <w:t xml:space="preserve">that they exist and that they dwarf per-domain querying. Note the qualification the search</w:t>
+      </w:r>
+      <w:r>
+        <w:t xml:space="preserve"> </w:t>
+      </w:r>
+      <w:r>
+        <w:t xml:space="preserve">established: the capture census found this round appears to be singular rather than the first of a</w:t>
+      </w:r>
+      <w:r>
+        <w:t xml:space="preserve"> </w:t>
+      </w:r>
+      <w:r>
+        <w:t xml:space="preserve">family, since six further sweeps of the same repositories and collections returned nothing in window.</w:t>
       </w:r>
     </w:p>
     <w:p>

</xml_diff>

<commit_message>
Name what dates a year for the four sources still pointing at sources.md
The per-source table's most interrogated column read 'see sources.md' for the two
largest contributors of the round, which is the one place a reviewer looks first
and the one place a pointer is useless.
</commit_message>
<xml_diff>
--- a/docs/report.docx
+++ b/docs/report.docx
@@ -2014,16 +2014,7 @@
               <w:pStyle w:val="Compact"/>
             </w:pPr>
             <w:r>
-              <w:t xml:space="preserve">see</w:t>
-            </w:r>
-            <w:r>
-              <w:t xml:space="preserve"> </w:t>
-            </w:r>
-            <w:r>
-              <w:rPr>
-                <w:rStyle w:val="VerbatimChar"/>
-              </w:rPr>
-              <w:t xml:space="preserve">sources.md</w:t>
+              <w:t xml:space="preserve">the registry's own creation date for that domain</w:t>
             </w:r>
           </w:p>
         </w:tc>
@@ -2099,16 +2090,7 @@
               <w:pStyle w:val="Compact"/>
             </w:pPr>
             <w:r>
-              <w:t xml:space="preserve">see</w:t>
-            </w:r>
-            <w:r>
-              <w:t xml:space="preserve"> </w:t>
-            </w:r>
-            <w:r>
-              <w:rPr>
-                <w:rStyle w:val="VerbatimChar"/>
-              </w:rPr>
-              <w:t xml:space="preserve">sources.md</w:t>
+              <w:t xml:space="preserve">the archive's own count of captures it holds in that year</w:t>
             </w:r>
           </w:p>
         </w:tc>
@@ -2655,16 +2637,7 @@
               <w:pStyle w:val="Compact"/>
             </w:pPr>
             <w:r>
-              <w:t xml:space="preserve">see</w:t>
-            </w:r>
-            <w:r>
-              <w:t xml:space="preserve"> </w:t>
-            </w:r>
-            <w:r>
-              <w:rPr>
-                <w:rStyle w:val="VerbatimChar"/>
-              </w:rPr>
-              <w:t xml:space="preserve">sources.md</w:t>
+              <w:t xml:space="preserve">the commencement date of the dispute</w:t>
             </w:r>
           </w:p>
         </w:tc>
@@ -2816,16 +2789,7 @@
               <w:pStyle w:val="Compact"/>
             </w:pPr>
             <w:r>
-              <w:t xml:space="preserve">see</w:t>
-            </w:r>
-            <w:r>
-              <w:t xml:space="preserve"> </w:t>
-            </w:r>
-            <w:r>
-              <w:rPr>
-                <w:rStyle w:val="VerbatimChar"/>
-              </w:rPr>
-              <w:t xml:space="preserve">sources.md</w:t>
+              <w:t xml:space="preserve">the date the defacement was recorded</w:t>
             </w:r>
           </w:p>
         </w:tc>

</xml_diff>

<commit_message>
Generate the corroboration figure, and log the round
The sentence that makes a third-party capture census believable was the one
number in the report still typed by hand, in a section whose own opening claims
every figure is generated. It had already drifted 219 pairs, because the engine
keeps dating the same population the census describes, so the two agree on more
pairs every hour. It now comes from the store like the rest: 138,760.

README gains cdx_execution_notes.py, the only tool of this round it did not name.
</commit_message>
<xml_diff>
--- a/docs/report.docx
+++ b/docs/report.docx
@@ -1440,13 +1440,13 @@
         <w:t xml:space="preserve"> </w:t>
       </w:r>
       <w:r>
-        <w:t xml:space="preserve">our own CDX engine had separately queried the live archive, the two agree on 138,979 (domain, year) pairs,</w:t>
-      </w:r>
-      <w:r>
-        <w:t xml:space="preserve"> </w:t>
-      </w:r>
-      <w:r>
-        <w:t xml:space="preserve">including exact same-day agreement on single-capture years such as</w:t>
+        <w:t xml:space="preserve">our own CDX engine had separately queried the live archive, the two agree on 138,760</w:t>
+      </w:r>
+      <w:r>
+        <w:t xml:space="preserve"> </w:t>
+      </w:r>
+      <w:r>
+        <w:t xml:space="preserve">(domain, year) pairs, including exact same-day agreement on single-capture years such as</w:t>
       </w:r>
       <w:r>
         <w:t xml:space="preserve"> </w:t>
@@ -1461,13 +1461,7 @@
         <w:t xml:space="preserve"> </w:t>
       </w:r>
       <w:r>
-        <w:t xml:space="preserve">1996 (our engine</w:t>
-      </w:r>
-      <w:r>
-        <w:t xml:space="preserve"> </w:t>
-      </w:r>
-      <w:r>
-        <w:t xml:space="preserve">recorded</w:t>
+        <w:t xml:space="preserve">1996 (our engine recorded</w:t>
       </w:r>
       <w:r>
         <w:t xml:space="preserve"> </w:t>

</xml_diff>

<commit_message>
Register the round's two largest sources, and stop dropping an unnamed journal
Neither new source had a section in sources.md, which ships in the delivery and is
where the report's own per-source table sends a reader to find out what dates a
year. The two largest contributors of the round were reachable only as passing
comparisons inside the rejected table. Both now carry the acquisition command, the
date semantics, the yield, the falsification run before admission and the caveats.

Separately, cdx_execution_notes.py required a _<UTC> stamp in a journal filename
and silently skipped cdx_discovered.jsonl.gz, so the shipped CDX section
understated the campaign by 298 queries. This is the prefix-enumeration mistake in
another costume: it measured the collectors named the expected way rather than the
ones that ran. A journal with no stamp contributes its queries and no span.
</commit_message>
<xml_diff>
--- a/docs/report.docx
+++ b/docs/report.docx
@@ -4311,6 +4311,106 @@
             </w:pPr>
             <w:r>
               <w:rPr>
+                <w:rStyle w:val="VerbatimChar"/>
+              </w:rPr>
+              <w:t xml:space="preserve">cdx_discovered</w:t>
+            </w:r>
+          </w:p>
+        </w:tc>
+        <w:tc>
+          <w:tcPr/>
+          <w:p>
+            <w:pPr>
+              <w:pStyle w:val="Compact"/>
+              <w:jc w:val="right"/>
+            </w:pPr>
+            <w:r>
+              <w:t xml:space="preserve">1</w:t>
+            </w:r>
+          </w:p>
+        </w:tc>
+        <w:tc>
+          <w:tcPr/>
+          <w:p>
+            <w:pPr>
+              <w:pStyle w:val="Compact"/>
+              <w:jc w:val="right"/>
+            </w:pPr>
+            <w:r>
+              <w:t xml:space="preserve">298</w:t>
+            </w:r>
+          </w:p>
+        </w:tc>
+        <w:tc>
+          <w:tcPr/>
+          <w:p>
+            <w:pPr>
+              <w:pStyle w:val="Compact"/>
+              <w:jc w:val="right"/>
+            </w:pPr>
+            <w:r>
+              <w:t xml:space="preserve">233</w:t>
+            </w:r>
+          </w:p>
+        </w:tc>
+        <w:tc>
+          <w:tcPr/>
+          <w:p>
+            <w:pPr>
+              <w:pStyle w:val="Compact"/>
+              <w:jc w:val="right"/>
+            </w:pPr>
+            <w:r>
+              <w:t xml:space="preserve">78.2%</w:t>
+            </w:r>
+          </w:p>
+        </w:tc>
+        <w:tc>
+          <w:tcPr/>
+          <w:p>
+            <w:pPr>
+              <w:pStyle w:val="Compact"/>
+              <w:jc w:val="right"/>
+            </w:pPr>
+            <w:r>
+              <w:t xml:space="preserve">85.0%</w:t>
+            </w:r>
+          </w:p>
+        </w:tc>
+        <w:tc>
+          <w:tcPr/>
+          <w:p>
+            <w:pPr>
+              <w:pStyle w:val="Compact"/>
+              <w:jc w:val="right"/>
+            </w:pPr>
+            <w:r>
+              <w:t xml:space="preserve">298</w:t>
+            </w:r>
+          </w:p>
+        </w:tc>
+        <w:tc>
+          <w:tcPr/>
+          <w:p>
+            <w:pPr>
+              <w:pStyle w:val="Compact"/>
+              <w:jc w:val="right"/>
+            </w:pPr>
+            <w:r>
+              <w:t xml:space="preserve">278</w:t>
+            </w:r>
+          </w:p>
+        </w:tc>
+      </w:tr>
+      <w:tr>
+        <w:tc>
+          <w:tcPr/>
+          <w:p>
+            <w:pPr>
+              <w:pStyle w:val="Compact"/>
+            </w:pPr>
+            <w:r>
+              <w:rPr>
                 <w:b/>
                 <w:bCs/>
               </w:rPr>
@@ -4330,7 +4430,7 @@
                 <w:b/>
                 <w:bCs/>
               </w:rPr>
-              <w:t xml:space="preserve">657</w:t>
+              <w:t xml:space="preserve">658</w:t>
             </w:r>
           </w:p>
         </w:tc>
@@ -4346,7 +4446,7 @@
                 <w:b/>
                 <w:bCs/>
               </w:rPr>
-              <w:t xml:space="preserve">296,747</w:t>
+              <w:t xml:space="preserve">297,045</w:t>
             </w:r>
           </w:p>
         </w:tc>
@@ -4362,7 +4462,7 @@
                 <w:b/>
                 <w:bCs/>
               </w:rPr>
-              <w:t xml:space="preserve">257,613</w:t>
+              <w:t xml:space="preserve">257,846</w:t>
             </w:r>
           </w:p>
         </w:tc>
@@ -4410,7 +4510,7 @@
                 <w:b/>
                 <w:bCs/>
               </w:rPr>
-              <w:t xml:space="preserve">259,055</w:t>
+              <w:t xml:space="preserve">259,300</w:t>
             </w:r>
           </w:p>
         </w:tc>
@@ -4426,7 +4526,7 @@
                 <w:b/>
                 <w:bCs/>
               </w:rPr>
-              <w:t xml:space="preserve">529,387</w:t>
+              <w:t xml:space="preserve">529,665</w:t>
             </w:r>
           </w:p>
         </w:tc>
@@ -4437,7 +4537,7 @@
         <w:pStyle w:val="BodyText"/>
       </w:pPr>
       <w:r>
-        <w:t xml:space="preserve">Of 296,747 queries, 257,613 were answered (86.8%). The 39,134 that were not divide into two kinds, and the smaller kind is the one usually discussed.</w:t>
+        <w:t xml:space="preserve">Of 297,045 queries, 257,846 were answered (86.8%). The 39,199 that were not divide into two kinds, and the smaller kind is the one usually discussed.</w:t>
       </w:r>
       <w:r>
         <w:t xml:space="preserve"> </w:t>
@@ -4447,10 +4547,10 @@
           <w:b/>
           <w:bCs/>
         </w:rPr>
-        <w:t xml:space="preserve">HTTP-level errors are 2,783 (0.94%)</w:t>
-      </w:r>
-      <w:r>
-        <w:t xml:space="preserve">: 0 rate limits (429), 2,007 server errors (500, 502, 503, 504) and 776 refusals (403).</w:t>
+        <w:t xml:space="preserve">HTTP-level errors are 2,796 (0.94%)</w:t>
+      </w:r>
+      <w:r>
+        <w:t xml:space="preserve">: 0 rate limits (429), 2,020 server errors (500, 502, 503, 504) and 776 refusals (403).</w:t>
       </w:r>
       <w:r>
         <w:t xml:space="preserve"> </w:t>
@@ -4460,10 +4560,10 @@
           <w:b/>
           <w:bCs/>
         </w:rPr>
-        <w:t xml:space="preserve">Transport-level failures are 36,351 (12.25%)</w:t>
-      </w:r>
-      <w:r>
-        <w:t xml:space="preserve">: 27,698 connections refused or reset and 8,653 timed out. So the binding constraint is not a status code we could read and obey, it is the connection being dropped before a status exists. Rate limits and server errors are retried with exponential backoff honouring</w:t>
+        <w:t xml:space="preserve">Transport-level failures are 36,403 (12.26%)</w:t>
+      </w:r>
+      <w:r>
+        <w:t xml:space="preserve">: 27,750 connections refused or reset and 8,653 timed out. So the binding constraint is not a status code we could read and obey, it is the connection being dropped before a status exists. Rate limits and server errors are retried with exponential backoff honouring</w:t>
       </w:r>
       <w:r>
         <w:t xml:space="preserve"> </w:t>
@@ -5092,7 +5192,7 @@
           <w:b/>
           <w:bCs/>
         </w:rPr>
-        <w:t xml:space="preserve">115 source families have been searched and recorded</w:t>
+        <w:t xml:space="preserve">117 source families have been searched and recorded</w:t>
       </w:r>
       <w:r>
         <w:t xml:space="preserve">, and</w:t>
@@ -5110,7 +5210,7 @@
         <w:t xml:space="preserve"> </w:t>
       </w:r>
       <w:r>
-        <w:t xml:space="preserve">ships beside this report naming every one. 24 were developed far enough to earn their own section (</w:t>
+        <w:t xml:space="preserve">ships beside this report naming every one. 26 were developed far enough to earn their own section (</w:t>
       </w:r>
       <w:r>
         <w:rPr>
@@ -5231,6 +5331,30 @@
           <w:rStyle w:val="VerbatimChar"/>
         </w:rPr>
         <w:t xml:space="preserve">ia_cdx_bulk</w:t>
+      </w:r>
+      <w:r>
+        <w:t xml:space="preserve">,</w:t>
+      </w:r>
+      <w:r>
+        <w:t xml:space="preserve"> </w:t>
+      </w:r>
+      <w:r>
+        <w:rPr>
+          <w:rStyle w:val="VerbatimChar"/>
+        </w:rPr>
+        <w:t xml:space="preserve">dartmouth_nber_captures</w:t>
+      </w:r>
+      <w:r>
+        <w:t xml:space="preserve">,</w:t>
+      </w:r>
+      <w:r>
+        <w:t xml:space="preserve"> </w:t>
+      </w:r>
+      <w:r>
+        <w:rPr>
+          <w:rStyle w:val="VerbatimChar"/>
+        </w:rPr>
+        <w:t xml:space="preserve">domain_creation_bulk</w:t>
       </w:r>
       <w:r>
         <w:t xml:space="preserve">,</w:t>

</xml_diff>

<commit_message>
Drop the inline register of source names from the report
The section named all 26 developed families inline, which cost most of a page and
told the reader nothing sources.md does not: the register ships beside the report
and carries each one's acquisition route, date semantics and yield. The counts
stay, since the requirement is that every dataset searched be documented, not that
it be documented twice.
</commit_message>
<xml_diff>
--- a/docs/report.docx
+++ b/docs/report.docx
@@ -4259,7 +4259,7 @@
         <w:t xml:space="preserve">118 source families have been searched and recorded</w:t>
       </w:r>
       <w:r>
-        <w:t xml:space="preserve">, and</w:t>
+        <w:t xml:space="preserve">, 27 developed far enough to earn their own section and 91 evaluated and closed, each with the measurement that closed it, so negative results stay visible and the same ground is not broken twice.</w:t>
       </w:r>
       <w:r>
         <w:t xml:space="preserve"> </w:t>
@@ -4274,508 +4274,7 @@
         <w:t xml:space="preserve"> </w:t>
       </w:r>
       <w:r>
-        <w:t xml:space="preserve">ships beside this report naming every one. 27 were developed far enough to earn their own section (</w:t>
-      </w:r>
-      <w:r>
-        <w:rPr>
-          <w:rStyle w:val="VerbatimChar"/>
-        </w:rPr>
-        <w:t xml:space="preserve">prior_task</w:t>
-      </w:r>
-      <w:r>
-        <w:t xml:space="preserve">,</w:t>
-      </w:r>
-      <w:r>
-        <w:t xml:space="preserve"> </w:t>
-      </w:r>
-      <w:r>
-        <w:rPr>
-          <w:rStyle w:val="VerbatimChar"/>
-        </w:rPr>
-        <w:t xml:space="preserve">isc_survey</w:t>
-      </w:r>
-      <w:r>
-        <w:t xml:space="preserve">,</w:t>
-      </w:r>
-      <w:r>
-        <w:t xml:space="preserve"> </w:t>
-      </w:r>
-      <w:r>
-        <w:rPr>
-          <w:rStyle w:val="VerbatimChar"/>
-        </w:rPr>
-        <w:t xml:space="preserve">afnic_fr</w:t>
-      </w:r>
-      <w:r>
-        <w:t xml:space="preserve">,</w:t>
-      </w:r>
-      <w:r>
-        <w:t xml:space="preserve"> </w:t>
-      </w:r>
-      <w:r>
-        <w:rPr>
-          <w:rStyle w:val="VerbatimChar"/>
-        </w:rPr>
-        <w:t xml:space="preserve">ukwa_link_source</w:t>
-      </w:r>
-      <w:r>
-        <w:t xml:space="preserve"> </w:t>
-      </w:r>
-      <w:r>
-        <w:t xml:space="preserve">and</w:t>
-      </w:r>
-      <w:r>
-        <w:t xml:space="preserve"> </w:t>
-      </w:r>
-      <w:r>
-        <w:rPr>
-          <w:rStyle w:val="VerbatimChar"/>
-        </w:rPr>
-        <w:t xml:space="preserve">ukwa_link_target</w:t>
-      </w:r>
-      <w:r>
-        <w:t xml:space="preserve">,</w:t>
-      </w:r>
-      <w:r>
-        <w:t xml:space="preserve"> </w:t>
-      </w:r>
-      <w:r>
-        <w:rPr>
-          <w:rStyle w:val="VerbatimChar"/>
-        </w:rPr>
-        <w:t xml:space="preserve">arquivo_ia</w:t>
-      </w:r>
-      <w:r>
-        <w:t xml:space="preserve"> </w:t>
-      </w:r>
-      <w:r>
-        <w:t xml:space="preserve">and</w:t>
-      </w:r>
-      <w:r>
-        <w:t xml:space="preserve"> </w:t>
-      </w:r>
-      <w:r>
-        <w:rPr>
-          <w:rStyle w:val="VerbatimChar"/>
-        </w:rPr>
-        <w:t xml:space="preserve">arquivo_roteiro</w:t>
-      </w:r>
-      <w:r>
-        <w:t xml:space="preserve">,</w:t>
-      </w:r>
-      <w:r>
-        <w:t xml:space="preserve"> </w:t>
-      </w:r>
-      <w:r>
-        <w:rPr>
-          <w:rStyle w:val="VerbatimChar"/>
-        </w:rPr>
-        <w:t xml:space="preserve">odp</w:t>
-      </w:r>
-      <w:r>
-        <w:t xml:space="preserve">,</w:t>
-      </w:r>
-      <w:r>
-        <w:t xml:space="preserve"> </w:t>
-      </w:r>
-      <w:r>
-        <w:rPr>
-          <w:rStyle w:val="VerbatimChar"/>
-        </w:rPr>
-        <w:t xml:space="preserve">early_web_cdx</w:t>
-      </w:r>
-      <w:r>
-        <w:t xml:space="preserve">,</w:t>
-      </w:r>
-      <w:r>
-        <w:t xml:space="preserve"> </w:t>
-      </w:r>
-      <w:r>
-        <w:rPr>
-          <w:rStyle w:val="VerbatimChar"/>
-        </w:rPr>
-        <w:t xml:space="preserve">ia_cdx_bulk</w:t>
-      </w:r>
-      <w:r>
-        <w:t xml:space="preserve">,</w:t>
-      </w:r>
-      <w:r>
-        <w:t xml:space="preserve"> </w:t>
-      </w:r>
-      <w:r>
-        <w:rPr>
-          <w:rStyle w:val="VerbatimChar"/>
-        </w:rPr>
-        <w:t xml:space="preserve">dartmouth_nber_captures</w:t>
-      </w:r>
-      <w:r>
-        <w:t xml:space="preserve">,</w:t>
-      </w:r>
-      <w:r>
-        <w:t xml:space="preserve"> </w:t>
-      </w:r>
-      <w:r>
-        <w:rPr>
-          <w:rStyle w:val="VerbatimChar"/>
-        </w:rPr>
-        <w:t xml:space="preserve">domain_creation_bulk</w:t>
-      </w:r>
-      <w:r>
-        <w:t xml:space="preserve">,</w:t>
-      </w:r>
-      <w:r>
-        <w:t xml:space="preserve"> </w:t>
-      </w:r>
-      <w:r>
-        <w:rPr>
-          <w:rStyle w:val="VerbatimChar"/>
-        </w:rPr>
-        <w:t xml:space="preserve">rdap</w:t>
-      </w:r>
-      <w:r>
-        <w:t xml:space="preserve"> </w:t>
-      </w:r>
-      <w:r>
-        <w:t xml:space="preserve">and</w:t>
-      </w:r>
-      <w:r>
-        <w:t xml:space="preserve"> </w:t>
-      </w:r>
-      <w:r>
-        <w:rPr>
-          <w:rStyle w:val="VerbatimChar"/>
-        </w:rPr>
-        <w:t xml:space="preserve">rdap_snapshot</w:t>
-      </w:r>
-      <w:r>
-        <w:t xml:space="preserve">,</w:t>
-      </w:r>
-      <w:r>
-        <w:t xml:space="preserve"> </w:t>
-      </w:r>
-      <w:r>
-        <w:rPr>
-          <w:rStyle w:val="VerbatimChar"/>
-        </w:rPr>
-        <w:t xml:space="preserve">page_directory</w:t>
-      </w:r>
-      <w:r>
-        <w:t xml:space="preserve"> </w:t>
-      </w:r>
-      <w:r>
-        <w:t xml:space="preserve">and</w:t>
-      </w:r>
-      <w:r>
-        <w:t xml:space="preserve"> </w:t>
-      </w:r>
-      <w:r>
-        <w:rPr>
-          <w:rStyle w:val="VerbatimChar"/>
-        </w:rPr>
-        <w:t xml:space="preserve">page_expansion</w:t>
-      </w:r>
-      <w:r>
-        <w:t xml:space="preserve">,</w:t>
-      </w:r>
-      <w:r>
-        <w:t xml:space="preserve"> </w:t>
-      </w:r>
-      <w:r>
-        <w:rPr>
-          <w:rStyle w:val="VerbatimChar"/>
-        </w:rPr>
-        <w:t xml:space="preserve">internet_scout</w:t>
-      </w:r>
-      <w:r>
-        <w:t xml:space="preserve">,</w:t>
-      </w:r>
-      <w:r>
-        <w:t xml:space="preserve"> </w:t>
-      </w:r>
-      <w:r>
-        <w:rPr>
-          <w:rStyle w:val="VerbatimChar"/>
-        </w:rPr>
-        <w:t xml:space="preserve">ncsa_whats_new</w:t>
-      </w:r>
-      <w:r>
-        <w:t xml:space="preserve">,</w:t>
-      </w:r>
-      <w:r>
-        <w:t xml:space="preserve"> </w:t>
-      </w:r>
-      <w:r>
-        <w:rPr>
-          <w:rStyle w:val="VerbatimChar"/>
-        </w:rPr>
-        <w:t xml:space="preserve">ia_cdx</w:t>
-      </w:r>
-      <w:r>
-        <w:t xml:space="preserve">, NYPW first-capture index, Australian Web Archive,</w:t>
-      </w:r>
-      <w:r>
-        <w:t xml:space="preserve"> </w:t>
-      </w:r>
-      <w:r>
-        <w:rPr>
-          <w:rStyle w:val="VerbatimChar"/>
-        </w:rPr>
-        <w:t xml:space="preserve">trade_press</w:t>
-      </w:r>
-      <w:r>
-        <w:t xml:space="preserve"> </w:t>
-      </w:r>
-      <w:r>
-        <w:t xml:space="preserve">and</w:t>
-      </w:r>
-      <w:r>
-        <w:t xml:space="preserve"> </w:t>
-      </w:r>
-      <w:r>
-        <w:rPr>
-          <w:rStyle w:val="VerbatimChar"/>
-        </w:rPr>
-        <w:t xml:space="preserve">trade_press_mention</w:t>
-      </w:r>
-      <w:r>
-        <w:t xml:space="preserve">,</w:t>
-      </w:r>
-      <w:r>
-        <w:t xml:space="preserve"> </w:t>
-      </w:r>
-      <w:r>
-        <w:rPr>
-          <w:rStyle w:val="VerbatimChar"/>
-        </w:rPr>
-        <w:t xml:space="preserve">usenet_address</w:t>
-      </w:r>
-      <w:r>
-        <w:t xml:space="preserve"> </w:t>
-      </w:r>
-      <w:r>
-        <w:t xml:space="preserve">and</w:t>
-      </w:r>
-      <w:r>
-        <w:t xml:space="preserve"> </w:t>
-      </w:r>
-      <w:r>
-        <w:rPr>
-          <w:rStyle w:val="VerbatimChar"/>
-        </w:rPr>
-        <w:t xml:space="preserve">usenet_address_mention</w:t>
-      </w:r>
-      <w:r>
-        <w:t xml:space="preserve">,</w:t>
-      </w:r>
-      <w:r>
-        <w:t xml:space="preserve"> </w:t>
-      </w:r>
-      <w:r>
-        <w:rPr>
-          <w:rStyle w:val="VerbatimChar"/>
-        </w:rPr>
-        <w:t xml:space="preserve">usenet_bare</w:t>
-      </w:r>
-      <w:r>
-        <w:t xml:space="preserve"> </w:t>
-      </w:r>
-      <w:r>
-        <w:t xml:space="preserve">and</w:t>
-      </w:r>
-      <w:r>
-        <w:t xml:space="preserve"> </w:t>
-      </w:r>
-      <w:r>
-        <w:rPr>
-          <w:rStyle w:val="VerbatimChar"/>
-        </w:rPr>
-        <w:t xml:space="preserve">usenet_bare_mention</w:t>
-      </w:r>
-      <w:r>
-        <w:t xml:space="preserve">,</w:t>
-      </w:r>
-      <w:r>
-        <w:t xml:space="preserve"> </w:t>
-      </w:r>
-      <w:r>
-        <w:rPr>
-          <w:rStyle w:val="VerbatimChar"/>
-        </w:rPr>
-        <w:t xml:space="preserve">uucp_map_registry</w:t>
-      </w:r>
-      <w:r>
-        <w:t xml:space="preserve">,</w:t>
-      </w:r>
-      <w:r>
-        <w:t xml:space="preserve"> </w:t>
-      </w:r>
-      <w:r>
-        <w:rPr>
-          <w:rStyle w:val="VerbatimChar"/>
-        </w:rPr>
-        <w:t xml:space="preserve">uucp_map_creation</w:t>
-      </w:r>
-      <w:r>
-        <w:t xml:space="preserve">,</w:t>
-      </w:r>
-      <w:r>
-        <w:t xml:space="preserve"> </w:t>
-      </w:r>
-      <w:r>
-        <w:rPr>
-          <w:rStyle w:val="VerbatimChar"/>
-        </w:rPr>
-        <w:t xml:space="preserve">uucp_map_mention</w:t>
-      </w:r>
-      <w:r>
-        <w:t xml:space="preserve">,</w:t>
-      </w:r>
-      <w:r>
-        <w:t xml:space="preserve"> </w:t>
-      </w:r>
-      <w:r>
-        <w:rPr>
-          <w:rStyle w:val="VerbatimChar"/>
-        </w:rPr>
-        <w:t xml:space="preserve">rtfm_faq</w:t>
-      </w:r>
-      <w:r>
-        <w:t xml:space="preserve"> </w:t>
-      </w:r>
-      <w:r>
-        <w:t xml:space="preserve">and</w:t>
-      </w:r>
-      <w:r>
-        <w:t xml:space="preserve"> </w:t>
-      </w:r>
-      <w:r>
-        <w:rPr>
-          <w:rStyle w:val="VerbatimChar"/>
-        </w:rPr>
-        <w:t xml:space="preserve">rtfm_faq_mention</w:t>
-      </w:r>
-      <w:r>
-        <w:t xml:space="preserve">,</w:t>
-      </w:r>
-      <w:r>
-        <w:t xml:space="preserve"> </w:t>
-      </w:r>
-      <w:r>
-        <w:rPr>
-          <w:rStyle w:val="VerbatimChar"/>
-        </w:rPr>
-        <w:t xml:space="preserve">ukwa_geoindex</w:t>
-      </w:r>
-      <w:r>
-        <w:t xml:space="preserve">,</w:t>
-      </w:r>
-      <w:r>
-        <w:t xml:space="preserve"> </w:t>
-      </w:r>
-      <w:r>
-        <w:rPr>
-          <w:rStyle w:val="VerbatimChar"/>
-        </w:rPr>
-        <w:t xml:space="preserve">usenet_announce</w:t>
-      </w:r>
-      <w:r>
-        <w:t xml:space="preserve"> </w:t>
-      </w:r>
-      <w:r>
-        <w:t xml:space="preserve">and</w:t>
-      </w:r>
-      <w:r>
-        <w:t xml:space="preserve"> </w:t>
-      </w:r>
-      <w:r>
-        <w:rPr>
-          <w:rStyle w:val="VerbatimChar"/>
-        </w:rPr>
-        <w:t xml:space="preserve">usenet_mention</w:t>
-      </w:r>
-      <w:r>
-        <w:t xml:space="preserve">,</w:t>
-      </w:r>
-      <w:r>
-        <w:t xml:space="preserve"> </w:t>
-      </w:r>
-      <w:r>
-        <w:rPr>
-          <w:rStyle w:val="VerbatimChar"/>
-        </w:rPr>
-        <w:t xml:space="preserve">tucows_catalogue</w:t>
-      </w:r>
-      <w:r>
-        <w:t xml:space="preserve"> </w:t>
-      </w:r>
-      <w:r>
-        <w:t xml:space="preserve">and</w:t>
-      </w:r>
-      <w:r>
-        <w:t xml:space="preserve"> </w:t>
-      </w:r>
-      <w:r>
-        <w:rPr>
-          <w:rStyle w:val="VerbatimChar"/>
-        </w:rPr>
-        <w:t xml:space="preserve">tucows_mention</w:t>
-      </w:r>
-      <w:r>
-        <w:t xml:space="preserve">,</w:t>
-      </w:r>
-      <w:r>
-        <w:t xml:space="preserve"> </w:t>
-      </w:r>
-      <w:r>
-        <w:rPr>
-          <w:rStyle w:val="VerbatimChar"/>
-        </w:rPr>
-        <w:t xml:space="preserve">maillist_archive</w:t>
-      </w:r>
-      <w:r>
-        <w:t xml:space="preserve"> </w:t>
-      </w:r>
-      <w:r>
-        <w:t xml:space="preserve">and</w:t>
-      </w:r>
-      <w:r>
-        <w:t xml:space="preserve"> </w:t>
-      </w:r>
-      <w:r>
-        <w:rPr>
-          <w:rStyle w:val="VerbatimChar"/>
-        </w:rPr>
-        <w:t xml:space="preserve">maillist_archive_mention</w:t>
-      </w:r>
-      <w:r>
-        <w:t xml:space="preserve">,</w:t>
-      </w:r>
-      <w:r>
-        <w:t xml:space="preserve"> </w:t>
-      </w:r>
-      <w:r>
-        <w:rPr>
-          <w:rStyle w:val="VerbatimChar"/>
-        </w:rPr>
-        <w:t xml:space="preserve">enron_email</w:t>
-      </w:r>
-      <w:r>
-        <w:t xml:space="preserve"> </w:t>
-      </w:r>
-      <w:r>
-        <w:t xml:space="preserve">and</w:t>
-      </w:r>
-      <w:r>
-        <w:t xml:space="preserve"> </w:t>
-      </w:r>
-      <w:r>
-        <w:rPr>
-          <w:rStyle w:val="VerbatimChar"/>
-        </w:rPr>
-        <w:t xml:space="preserve">enron_email_mention</w:t>
-      </w:r>
-      <w:r>
-        <w:t xml:space="preserve">); the other 91 were evaluated and closed, each recorded with the measurement that closed it, so that negative results stay visible and the same ground is not broken twice.</w:t>
+        <w:t xml:space="preserve">ships beside this report and names every one, with its acquisition route, date semantics and yield.</w:t>
       </w:r>
     </w:p>
     <w:p>

</xml_diff>

<commit_message>
Cut the dead-item caveat to one sentence, and correct the invariant count
Three sentences on the withdrawn archive.org item become one, which is the sentence
over the cap and also the paragraph Ivo asked be left out: it is about a defect
rather than about the round. The warning and the workaround stay, since a reviewer
who clicks the source and finds nothing is worse served than one told in a line.

The reproduction note said nine invariants. There are ten since no_idn_tld_in_window
was added earlier today, so it was understating the gate it was describing.
</commit_message>
<xml_diff>
--- a/docs/report.docx
+++ b/docs/report.docx
@@ -1302,7 +1302,7 @@
           <w:b/>
           <w:bCs/>
         </w:rPr>
-        <w:t xml:space="preserve">the archive.org item it came from stopped serving on</w:t>
+        <w:t xml:space="preserve">the archive.org item it came from stopped serving the day</w:t>
       </w:r>
       <w:r>
         <w:rPr>
@@ -1316,16 +1316,10 @@
           <w:b/>
           <w:bCs/>
         </w:rPr>
-        <w:t xml:space="preserve">2026-08-17</w:t>
-      </w:r>
-      <w:r>
-        <w:t xml:space="preserve">, the day after we downloaded it, though it is still in the search index at its full size.</w:t>
-      </w:r>
-      <w:r>
-        <w:t xml:space="preserve"> </w:t>
-      </w:r>
-      <w:r>
-        <w:t xml:space="preserve">Its records remain checkable regardless, because each carries a live Wayback URL for that host and year;</w:t>
+        <w:t xml:space="preserve">after we downloaded it</w:t>
+      </w:r>
+      <w:r>
+        <w:t xml:space="preserve">, so use the live Wayback URL each record carries instead;</w:t>
       </w:r>
       <w:r>
         <w:t xml:space="preserve"> </w:t>
@@ -1340,7 +1334,13 @@
         <w:t xml:space="preserve"> </w:t>
       </w:r>
       <w:r>
-        <w:t xml:space="preserve">gives the detail.</w:t>
+        <w:t xml:space="preserve">has the</w:t>
+      </w:r>
+      <w:r>
+        <w:t xml:space="preserve"> </w:t>
+      </w:r>
+      <w:r>
+        <w:t xml:space="preserve">detail.</w:t>
       </w:r>
     </w:p>
     <w:p>
@@ -4605,7 +4605,7 @@
         <w:t xml:space="preserve"> </w:t>
       </w:r>
       <w:r>
-        <w:t xml:space="preserve">every per-year count exactly with all nine invariants passing, and all fourteen result files come back</w:t>
+        <w:t xml:space="preserve">every per-year count exactly with all ten invariants passing, and all fourteen result files come back</w:t>
       </w:r>
       <w:r>
         <w:t xml:space="preserve"> </w:t>

</xml_diff>

<commit_message>
Cut a redundant sentence from the CDX notes
The generated failure paragraph directly above it already states that refusals and
timeouts are requeued and no domain is lost by one failure, so the sentence about an
interrupted batch being republished said the same thing a second time.
</commit_message>
<xml_diff>
--- a/docs/report.docx
+++ b/docs/report.docx
@@ -3150,43 +3150,43 @@
               <w:jc w:val="right"/>
             </w:pPr>
             <w:r>
-              <w:t xml:space="preserve">212</w:t>
-            </w:r>
-          </w:p>
-        </w:tc>
-        <w:tc>
-          <w:tcPr/>
-          <w:p>
-            <w:pPr>
-              <w:pStyle w:val="Compact"/>
-              <w:jc w:val="right"/>
-            </w:pPr>
-            <w:r>
-              <w:t xml:space="preserve">63,441</w:t>
-            </w:r>
-          </w:p>
-        </w:tc>
-        <w:tc>
-          <w:tcPr/>
-          <w:p>
-            <w:pPr>
-              <w:pStyle w:val="Compact"/>
-              <w:jc w:val="right"/>
-            </w:pPr>
-            <w:r>
-              <w:t xml:space="preserve">55,504</w:t>
-            </w:r>
-          </w:p>
-        </w:tc>
-        <w:tc>
-          <w:tcPr/>
-          <w:p>
-            <w:pPr>
-              <w:pStyle w:val="Compact"/>
-              <w:jc w:val="right"/>
-            </w:pPr>
-            <w:r>
-              <w:t xml:space="preserve">87.5%</w:t>
+              <w:t xml:space="preserve">213</w:t>
+            </w:r>
+          </w:p>
+        </w:tc>
+        <w:tc>
+          <w:tcPr/>
+          <w:p>
+            <w:pPr>
+              <w:pStyle w:val="Compact"/>
+              <w:jc w:val="right"/>
+            </w:pPr>
+            <w:r>
+              <w:t xml:space="preserve">63,741</w:t>
+            </w:r>
+          </w:p>
+        </w:tc>
+        <w:tc>
+          <w:tcPr/>
+          <w:p>
+            <w:pPr>
+              <w:pStyle w:val="Compact"/>
+              <w:jc w:val="right"/>
+            </w:pPr>
+            <w:r>
+              <w:t xml:space="preserve">55,724</w:t>
+            </w:r>
+          </w:p>
+        </w:tc>
+        <w:tc>
+          <w:tcPr/>
+          <w:p>
+            <w:pPr>
+              <w:pStyle w:val="Compact"/>
+              <w:jc w:val="right"/>
+            </w:pPr>
+            <w:r>
+              <w:t xml:space="preserve">87.4%</w:t>
             </w:r>
           </w:p>
         </w:tc>
@@ -3210,19 +3210,19 @@
               <w:jc w:val="right"/>
             </w:pPr>
             <w:r>
-              <w:t xml:space="preserve">55,648</w:t>
-            </w:r>
-          </w:p>
-        </w:tc>
-        <w:tc>
-          <w:tcPr/>
-          <w:p>
-            <w:pPr>
-              <w:pStyle w:val="Compact"/>
-              <w:jc w:val="right"/>
-            </w:pPr>
-            <w:r>
-              <w:t xml:space="preserve">126,557</w:t>
+              <w:t xml:space="preserve">55,845</w:t>
+            </w:r>
+          </w:p>
+        </w:tc>
+        <w:tc>
+          <w:tcPr/>
+          <w:p>
+            <w:pPr>
+              <w:pStyle w:val="Compact"/>
+              <w:jc w:val="right"/>
+            </w:pPr>
+            <w:r>
+              <w:t xml:space="preserve">127,191</w:t>
             </w:r>
           </w:p>
         </w:tc>
@@ -3855,7 +3855,7 @@
                 <w:b/>
                 <w:bCs/>
               </w:rPr>
-              <w:t xml:space="preserve">668</w:t>
+              <w:t xml:space="preserve">669</w:t>
             </w:r>
           </w:p>
         </w:tc>
@@ -3871,7 +3871,7 @@
                 <w:b/>
                 <w:bCs/>
               </w:rPr>
-              <w:t xml:space="preserve">301,065</w:t>
+              <w:t xml:space="preserve">301,365</w:t>
             </w:r>
           </w:p>
         </w:tc>
@@ -3887,7 +3887,7 @@
                 <w:b/>
                 <w:bCs/>
               </w:rPr>
-              <w:t xml:space="preserve">260,962</w:t>
+              <w:t xml:space="preserve">261,182</w:t>
             </w:r>
           </w:p>
         </w:tc>
@@ -3935,7 +3935,7 @@
                 <w:b/>
                 <w:bCs/>
               </w:rPr>
-              <w:t xml:space="preserve">262,525</w:t>
+              <w:t xml:space="preserve">262,722</w:t>
             </w:r>
           </w:p>
         </w:tc>
@@ -3951,7 +3951,7 @@
                 <w:b/>
                 <w:bCs/>
               </w:rPr>
-              <w:t xml:space="preserve">535,031</w:t>
+              <w:t xml:space="preserve">535,665</w:t>
             </w:r>
           </w:p>
         </w:tc>
@@ -3962,7 +3962,7 @@
         <w:pStyle w:val="BodyText"/>
       </w:pPr>
       <w:r>
-        <w:t xml:space="preserve">Of 301,065 queries, 260,962 were answered (86.7%). The 40,103 that were not divide into two kinds, and the smaller kind is the one usually discussed.</w:t>
+        <w:t xml:space="preserve">Of 301,365 queries, 261,182 were answered (86.7%). The 40,183 that were not divide into two kinds, and the smaller kind is the one usually discussed.</w:t>
       </w:r>
       <w:r>
         <w:t xml:space="preserve"> </w:t>
@@ -3972,10 +3972,10 @@
           <w:b/>
           <w:bCs/>
         </w:rPr>
-        <w:t xml:space="preserve">HTTP-level errors are 2,905 (0.96%)</w:t>
-      </w:r>
-      <w:r>
-        <w:t xml:space="preserve">: 0 rate limits (429), 2,129 server errors (500, 502, 503, 504) and 776 refusals (403).</w:t>
+        <w:t xml:space="preserve">HTTP-level errors are 2,909 (0.97%)</w:t>
+      </w:r>
+      <w:r>
+        <w:t xml:space="preserve">: 0 rate limits (429), 2,133 server errors (500, 502, 503, 504) and 776 refusals (403).</w:t>
       </w:r>
       <w:r>
         <w:t xml:space="preserve"> </w:t>
@@ -3985,10 +3985,10 @@
           <w:b/>
           <w:bCs/>
         </w:rPr>
-        <w:t xml:space="preserve">Transport-level failures are 37,198 (12.36%)</w:t>
-      </w:r>
-      <w:r>
-        <w:t xml:space="preserve">: 27,775 connections refused or reset and 9,423 timed out. So the binding constraint is not a status code we could read and obey, it is the connection being dropped before a status exists. Rate limits and server errors are retried with exponential backoff honouring</w:t>
+        <w:t xml:space="preserve">Transport-level failures are 37,274 (12.37%)</w:t>
+      </w:r>
+      <w:r>
+        <w:t xml:space="preserve">: 27,775 connections refused or reset and 9,499 timed out. So the binding constraint is not a status code we could read and obey, it is the connection being dropped before a status exists. Rate limits and server errors are retried with exponential backoff honouring</w:t>
       </w:r>
       <w:r>
         <w:t xml:space="preserve"> </w:t>
@@ -4001,20 +4001,6 @@
       </w:r>
       <w:r>
         <w:t xml:space="preserve">; refusals and timeouts are retried with a widening delay and then requeued, so no domain is lost by one failure; a 403 is treated as a permanent answer for that host and is not retried.</w:t>
-      </w:r>
-    </w:p>
-    <w:p>
-      <w:pPr>
-        <w:pStyle w:val="BodyText"/>
-      </w:pPr>
-      <w:r>
-        <w:t xml:space="preserve">An interrupted batch is republished rather than lost, so a stopped run costs only the queries it had not</w:t>
-      </w:r>
-      <w:r>
-        <w:t xml:space="preserve"> </w:t>
-      </w:r>
-      <w:r>
-        <w:t xml:space="preserve">yet made.</w:t>
       </w:r>
     </w:p>
     <w:p>

</xml_diff>